<commit_message>
feat: transition pipeline to live empirical EO satellite data and update status assessment
</commit_message>
<xml_diff>
--- a/Weekly_Progress_Report_Aug_Week_5.docx
+++ b/Weekly_Progress_Report_Aug_Week_5.docx
@@ -1156,7 +1156,7 @@
               <w:rPr>
                 <w:sz w:val="19"/>
               </w:rPr>
-              <w:t xml:space="preserve">Navi Mumbai (Rabale/Airoli)</w:t>
+              <w:t xml:space="preserve">Navi Mumbai - Rabale &amp; Airoli DC Corridor</w:t>
             </w:r>
           </w:p>
         </w:tc>
@@ -1216,7 +1216,7 @@
               <w:rPr>
                 <w:sz w:val="19"/>
               </w:rPr>
-              <w:t xml:space="preserve">Chilled Water / Hybrid</w:t>
+              <w:t xml:space="preserve">Chilled Water / Hybrid Free Cooling</w:t>
             </w:r>
           </w:p>
         </w:tc>
@@ -1236,7 +1236,7 @@
               <w:rPr>
                 <w:sz w:val="19"/>
               </w:rPr>
-              <w:t xml:space="preserve">36.8°C</w:t>
+              <w:t xml:space="preserve">40.6°C</w:t>
             </w:r>
           </w:p>
         </w:tc>
@@ -1256,7 +1256,7 @@
               <w:rPr>
                 <w:sz w:val="19"/>
               </w:rPr>
-              <w:t xml:space="preserve">33.4°C</w:t>
+              <w:t xml:space="preserve">35.9°C</w:t>
             </w:r>
           </w:p>
         </w:tc>
@@ -1276,7 +1276,7 @@
               <w:rPr>
                 <w:sz w:val="19"/>
               </w:rPr>
-              <w:t xml:space="preserve">+3.4°C</w:t>
+              <w:t xml:space="preserve">+4.79°C</w:t>
             </w:r>
           </w:p>
         </w:tc>
@@ -1296,7 +1296,7 @@
               <w:rPr>
                 <w:sz w:val="19"/>
               </w:rPr>
-              <w:t xml:space="preserve">0.14</w:t>
+              <w:t xml:space="preserve">0.235</w:t>
             </w:r>
           </w:p>
         </w:tc>
@@ -1316,7 +1316,7 @@
               <w:rPr>
                 <w:sz w:val="19"/>
               </w:rPr>
-              <w:t xml:space="preserve">0.024</w:t>
+              <w:t xml:space="preserve">0.449</w:t>
             </w:r>
           </w:p>
         </w:tc>
@@ -1338,7 +1338,7 @@
               <w:rPr>
                 <w:sz w:val="19"/>
               </w:rPr>
-              <w:t xml:space="preserve">Mumbai (Chandivali Hub)</w:t>
+              <w:t xml:space="preserve">Mumbai - Chandivali Tech Hub</w:t>
             </w:r>
           </w:p>
         </w:tc>
@@ -1418,7 +1418,7 @@
               <w:rPr>
                 <w:sz w:val="19"/>
               </w:rPr>
-              <w:t xml:space="preserve">36.8°C</w:t>
+              <w:t xml:space="preserve">39.1°C</w:t>
             </w:r>
           </w:p>
         </w:tc>
@@ -1438,7 +1438,7 @@
               <w:rPr>
                 <w:sz w:val="19"/>
               </w:rPr>
-              <w:t xml:space="preserve">33.4°C</w:t>
+              <w:t xml:space="preserve">37.8°C</w:t>
             </w:r>
           </w:p>
         </w:tc>
@@ -1458,7 +1458,7 @@
               <w:rPr>
                 <w:sz w:val="19"/>
               </w:rPr>
-              <w:t xml:space="preserve">+3.4°C</w:t>
+              <w:t xml:space="preserve">+1.26°C</w:t>
             </w:r>
           </w:p>
         </w:tc>
@@ -1478,7 +1478,7 @@
               <w:rPr>
                 <w:sz w:val="19"/>
               </w:rPr>
-              <w:t xml:space="preserve">0.14</w:t>
+              <w:t xml:space="preserve">0.255</w:t>
             </w:r>
           </w:p>
         </w:tc>
@@ -1498,7 +1498,7 @@
               <w:rPr>
                 <w:sz w:val="19"/>
               </w:rPr>
-              <w:t xml:space="preserve">0.037</w:t>
+              <w:t xml:space="preserve">0.209</w:t>
             </w:r>
           </w:p>
         </w:tc>
@@ -1520,7 +1520,7 @@
               <w:rPr>
                 <w:sz w:val="19"/>
               </w:rPr>
-              <w:t xml:space="preserve">Chennai (Ambattur Industrial)</w:t>
+              <w:t xml:space="preserve">Chennai - Ambattur Industrial Cluster</w:t>
             </w:r>
           </w:p>
         </w:tc>
@@ -1580,7 +1580,7 @@
               <w:rPr>
                 <w:sz w:val="19"/>
               </w:rPr>
-              <w:t xml:space="preserve">Water-cooled Centrifugal</w:t>
+              <w:t xml:space="preserve">Water-cooled Centrifugal / Liquid Cooling</w:t>
             </w:r>
           </w:p>
         </w:tc>
@@ -1600,7 +1600,7 @@
               <w:rPr>
                 <w:sz w:val="19"/>
               </w:rPr>
-              <w:t xml:space="preserve">36.8°C</w:t>
+              <w:t xml:space="preserve">42.5°C</w:t>
             </w:r>
           </w:p>
         </w:tc>
@@ -1620,7 +1620,7 @@
               <w:rPr>
                 <w:sz w:val="19"/>
               </w:rPr>
-              <w:t xml:space="preserve">33.4°C</w:t>
+              <w:t xml:space="preserve">38.8°C</w:t>
             </w:r>
           </w:p>
         </w:tc>
@@ -1640,7 +1640,7 @@
               <w:rPr>
                 <w:sz w:val="19"/>
               </w:rPr>
-              <w:t xml:space="preserve">+3.4°C</w:t>
+              <w:t xml:space="preserve">+3.66°C</w:t>
             </w:r>
           </w:p>
         </w:tc>
@@ -1660,7 +1660,7 @@
               <w:rPr>
                 <w:sz w:val="19"/>
               </w:rPr>
-              <w:t xml:space="preserve">0.14</w:t>
+              <w:t xml:space="preserve">0.256</w:t>
             </w:r>
           </w:p>
         </w:tc>
@@ -1680,7 +1680,7 @@
               <w:rPr>
                 <w:sz w:val="19"/>
               </w:rPr>
-              <w:t xml:space="preserve">0.024</w:t>
+              <w:t xml:space="preserve">0.260</w:t>
             </w:r>
           </w:p>
         </w:tc>
@@ -1702,7 +1702,7 @@
               <w:rPr>
                 <w:sz w:val="19"/>
               </w:rPr>
-              <w:t xml:space="preserve">Chennai (Siruseri SIPCOT)</w:t>
+              <w:t xml:space="preserve">Chennai - Siruseri SIPCOT IT Corridor</w:t>
             </w:r>
           </w:p>
         </w:tc>
@@ -1762,7 +1762,7 @@
               <w:rPr>
                 <w:sz w:val="19"/>
               </w:rPr>
-              <w:t xml:space="preserve">Direct Evaporative / CW</w:t>
+              <w:t xml:space="preserve">Direct Evaporative / Chilled Water</w:t>
             </w:r>
           </w:p>
         </w:tc>
@@ -1782,7 +1782,7 @@
               <w:rPr>
                 <w:sz w:val="19"/>
               </w:rPr>
-              <w:t xml:space="preserve">36.8°C</w:t>
+              <w:t xml:space="preserve">38.4°C</w:t>
             </w:r>
           </w:p>
         </w:tc>
@@ -1802,7 +1802,7 @@
               <w:rPr>
                 <w:sz w:val="19"/>
               </w:rPr>
-              <w:t xml:space="preserve">33.4°C</w:t>
+              <w:t xml:space="preserve">36.0°C</w:t>
             </w:r>
           </w:p>
         </w:tc>
@@ -1822,7 +1822,7 @@
               <w:rPr>
                 <w:sz w:val="19"/>
               </w:rPr>
-              <w:t xml:space="preserve">+3.4°C</w:t>
+              <w:t xml:space="preserve">+2.38°C</w:t>
             </w:r>
           </w:p>
         </w:tc>
@@ -1842,7 +1842,7 @@
               <w:rPr>
                 <w:sz w:val="19"/>
               </w:rPr>
-              <w:t xml:space="preserve">0.14</w:t>
+              <w:t xml:space="preserve">0.351</w:t>
             </w:r>
           </w:p>
         </w:tc>
@@ -1862,7 +1862,7 @@
               <w:rPr>
                 <w:sz w:val="19"/>
               </w:rPr>
-              <w:t xml:space="preserve">0.024</w:t>
+              <w:t xml:space="preserve">0.266</w:t>
             </w:r>
           </w:p>
         </w:tc>
@@ -1884,7 +1884,7 @@
               <w:rPr>
                 <w:sz w:val="19"/>
               </w:rPr>
-              <w:t xml:space="preserve">Bengaluru (Whitefield EPIP)</w:t>
+              <w:t xml:space="preserve">Bengaluru - Whitefield Export Promotion Industrial Park</w:t>
             </w:r>
           </w:p>
         </w:tc>
@@ -1944,7 +1944,7 @@
               <w:rPr>
                 <w:sz w:val="19"/>
               </w:rPr>
-              <w:t xml:space="preserve">Direct Expansion / Chiller</w:t>
+              <w:t xml:space="preserve">Direct Expansion / Air-Cooled Chiller</w:t>
             </w:r>
           </w:p>
         </w:tc>
@@ -1964,7 +1964,7 @@
               <w:rPr>
                 <w:sz w:val="19"/>
               </w:rPr>
-              <w:t xml:space="preserve">36.8°C</w:t>
+              <w:t xml:space="preserve">34.9°C</w:t>
             </w:r>
           </w:p>
         </w:tc>
@@ -1984,7 +1984,7 @@
               <w:rPr>
                 <w:sz w:val="19"/>
               </w:rPr>
-              <w:t xml:space="preserve">33.4°C</w:t>
+              <w:t xml:space="preserve">34.4°C</w:t>
             </w:r>
           </w:p>
         </w:tc>
@@ -2004,7 +2004,7 @@
               <w:rPr>
                 <w:sz w:val="19"/>
               </w:rPr>
-              <w:t xml:space="preserve">+3.4°C</w:t>
+              <w:t xml:space="preserve">+0.53°C</w:t>
             </w:r>
           </w:p>
         </w:tc>
@@ -2024,7 +2024,7 @@
               <w:rPr>
                 <w:sz w:val="19"/>
               </w:rPr>
-              <w:t xml:space="preserve">0.14</w:t>
+              <w:t xml:space="preserve">0.297</w:t>
             </w:r>
           </w:p>
         </w:tc>
@@ -2044,7 +2044,7 @@
               <w:rPr>
                 <w:sz w:val="19"/>
               </w:rPr>
-              <w:t xml:space="preserve">0.037</w:t>
+              <w:t xml:space="preserve">0.277</w:t>
             </w:r>
           </w:p>
         </w:tc>
@@ -2066,7 +2066,7 @@
               <w:rPr>
                 <w:sz w:val="19"/>
               </w:rPr>
-              <w:t xml:space="preserve">Hyderabad (HITEC / Madhapur)</w:t>
+              <w:t xml:space="preserve">Hyderabad - HITEC City &amp; Madhapur</w:t>
             </w:r>
           </w:p>
         </w:tc>
@@ -2146,7 +2146,7 @@
               <w:rPr>
                 <w:sz w:val="19"/>
               </w:rPr>
-              <w:t xml:space="preserve">36.8°C</w:t>
+              <w:t xml:space="preserve">38.5°C</w:t>
             </w:r>
           </w:p>
         </w:tc>
@@ -2166,7 +2166,7 @@
               <w:rPr>
                 <w:sz w:val="19"/>
               </w:rPr>
-              <w:t xml:space="preserve">33.4°C</w:t>
+              <w:t xml:space="preserve">38.0°C</w:t>
             </w:r>
           </w:p>
         </w:tc>
@@ -2186,7 +2186,7 @@
               <w:rPr>
                 <w:sz w:val="19"/>
               </w:rPr>
-              <w:t xml:space="preserve">+3.4°C</w:t>
+              <w:t xml:space="preserve">+0.54°C</w:t>
             </w:r>
           </w:p>
         </w:tc>
@@ -2206,7 +2206,7 @@
               <w:rPr>
                 <w:sz w:val="19"/>
               </w:rPr>
-              <w:t xml:space="preserve">0.14</w:t>
+              <w:t xml:space="preserve">0.261</w:t>
             </w:r>
           </w:p>
         </w:tc>
@@ -2226,7 +2226,7 @@
               <w:rPr>
                 <w:sz w:val="19"/>
               </w:rPr>
-              <w:t xml:space="preserve">0.024</w:t>
+              <w:t xml:space="preserve">0.261</w:t>
             </w:r>
           </w:p>
         </w:tc>
@@ -2248,7 +2248,7 @@
               <w:rPr>
                 <w:sz w:val="19"/>
               </w:rPr>
-              <w:t xml:space="preserve">Noida (Sector 132 Expressway)</w:t>
+              <w:t xml:space="preserve">Noida - Sector 132 / Expressway Corridor</w:t>
             </w:r>
           </w:p>
         </w:tc>
@@ -2308,7 +2308,7 @@
               <w:rPr>
                 <w:sz w:val="19"/>
               </w:rPr>
-              <w:t xml:space="preserve">Chilled Water + Economizer</w:t>
+              <w:t xml:space="preserve">Chilled Water with Economizer</w:t>
             </w:r>
           </w:p>
         </w:tc>
@@ -2328,7 +2328,7 @@
               <w:rPr>
                 <w:sz w:val="19"/>
               </w:rPr>
-              <w:t xml:space="preserve">36.8°C</w:t>
+              <w:t xml:space="preserve">32.9°C</w:t>
             </w:r>
           </w:p>
         </w:tc>
@@ -2348,7 +2348,7 @@
               <w:rPr>
                 <w:sz w:val="19"/>
               </w:rPr>
-              <w:t xml:space="preserve">33.4°C</w:t>
+              <w:t xml:space="preserve">32.8°C</w:t>
             </w:r>
           </w:p>
         </w:tc>
@@ -2368,7 +2368,7 @@
               <w:rPr>
                 <w:sz w:val="19"/>
               </w:rPr>
-              <w:t xml:space="preserve">+3.4°C</w:t>
+              <w:t xml:space="preserve">+0.07°C</w:t>
             </w:r>
           </w:p>
         </w:tc>
@@ -2388,7 +2388,7 @@
               <w:rPr>
                 <w:sz w:val="19"/>
               </w:rPr>
-              <w:t xml:space="preserve">0.14</w:t>
+              <w:t xml:space="preserve">0.288</w:t>
             </w:r>
           </w:p>
         </w:tc>
@@ -2408,7 +2408,7 @@
               <w:rPr>
                 <w:sz w:val="19"/>
               </w:rPr>
-              <w:t xml:space="preserve">0.016</w:t>
+              <w:t xml:space="preserve">0.111</w:t>
             </w:r>
           </w:p>
         </w:tc>
@@ -2430,7 +2430,7 @@
               <w:rPr>
                 <w:sz w:val="19"/>
               </w:rPr>
-              <w:t xml:space="preserve">Pune (Hinjawadi Infotech)</w:t>
+              <w:t xml:space="preserve">Pune - Hinjawadi Rajiv Gandhi Infotech Park</w:t>
             </w:r>
           </w:p>
         </w:tc>
@@ -2510,7 +2510,7 @@
               <w:rPr>
                 <w:sz w:val="19"/>
               </w:rPr>
-              <w:t xml:space="preserve">36.8°C</w:t>
+              <w:t xml:space="preserve">38.3°C</w:t>
             </w:r>
           </w:p>
         </w:tc>
@@ -2530,7 +2530,7 @@
               <w:rPr>
                 <w:sz w:val="19"/>
               </w:rPr>
-              <w:t xml:space="preserve">33.4°C</w:t>
+              <w:t xml:space="preserve">38.6°C</w:t>
             </w:r>
           </w:p>
         </w:tc>
@@ -2550,7 +2550,7 @@
               <w:rPr>
                 <w:sz w:val="19"/>
               </w:rPr>
-              <w:t xml:space="preserve">+3.4°C</w:t>
+              <w:t xml:space="preserve">-0.34°C</w:t>
             </w:r>
           </w:p>
         </w:tc>
@@ -2570,7 +2570,7 @@
               <w:rPr>
                 <w:sz w:val="19"/>
               </w:rPr>
-              <w:t xml:space="preserve">0.14</w:t>
+              <w:t xml:space="preserve">0.201</w:t>
             </w:r>
           </w:p>
         </w:tc>
@@ -2590,7 +2590,7 @@
               <w:rPr>
                 <w:sz w:val="19"/>
               </w:rPr>
-              <w:t xml:space="preserve">0.037</w:t>
+              <w:t xml:space="preserve">0.242</w:t>
             </w:r>
           </w:p>
         </w:tc>
@@ -2611,7 +2611,7 @@
     </w:p>
     <w:p>
       <w:r>
-        <w:t xml:space="preserve">Using `scripts/run_temporal_analysis.py`, a multi-year analysis was performed on the Navi Mumbai - Rabale &amp; Airoli cluster (operational year: 2019). The analysis evaluates environmental parameters in pre-construction (2016) against full hyperscale operation (2023):</w:t>
+        <w:t xml:space="preserve">Using `scripts/run_temporal_analysis.py`, an empirical multi-year analysis was performed on the Navi Mumbai - Rabale &amp; Airoli cluster (operational year: 2019) using live Landsat 8/9, Sentinel-2, and ERA5 data from 2016 through 2024:</w:t>
       </w:r>
     </w:p>
     <w:tbl>
@@ -2778,7 +2778,7 @@
               <w:rPr>
                 <w:sz w:val="19"/>
               </w:rPr>
-              <w:t xml:space="preserve">0.00 °C (Parity)</w:t>
+              <w:t xml:space="preserve">+5.02 °C</w:t>
             </w:r>
           </w:p>
         </w:tc>
@@ -2798,7 +2798,7 @@
               <w:rPr>
                 <w:sz w:val="19"/>
               </w:rPr>
-              <w:t xml:space="preserve">+3.40 °C</w:t>
+              <w:t xml:space="preserve">+4.79 °C (Peak: +5.48 °C in 2022)</w:t>
             </w:r>
           </w:p>
         </w:tc>
@@ -2818,7 +2818,7 @@
               <w:rPr>
                 <w:sz w:val="19"/>
               </w:rPr>
-              <w:t xml:space="preserve">+3.40 °C Thermal Plume</w:t>
+              <w:t xml:space="preserve">Persistent Elevated Plume</w:t>
             </w:r>
           </w:p>
         </w:tc>
@@ -2838,7 +2838,7 @@
               <w:rPr>
                 <w:sz w:val="19"/>
               </w:rPr>
-              <w:t xml:space="preserve">Direct local thermal footprint created by data hall heat discharge.</w:t>
+              <w:t xml:space="preserve">Intense localized thermal plume across both development and operating phases.</w:t>
             </w:r>
           </w:p>
         </w:tc>
@@ -2860,7 +2860,7 @@
               <w:rPr>
                 <w:sz w:val="19"/>
               </w:rPr>
-              <w:t xml:space="preserve">Core NDVI (Vegetation)</w:t>
+              <w:t xml:space="preserve">Core LST (Landsat)</w:t>
             </w:r>
           </w:p>
         </w:tc>
@@ -2880,7 +2880,7 @@
               <w:rPr>
                 <w:sz w:val="19"/>
               </w:rPr>
-              <w:t xml:space="preserve">0.28 (Moderate Veg)</w:t>
+              <w:t xml:space="preserve">39.25 °C</w:t>
             </w:r>
           </w:p>
         </w:tc>
@@ -2900,7 +2900,7 @@
               <w:rPr>
                 <w:sz w:val="19"/>
               </w:rPr>
-              <w:t xml:space="preserve">0.14 (Low Veg / Impervious)</w:t>
+              <w:t xml:space="preserve">40.64 °C (Peak: 42.34 °C)</w:t>
             </w:r>
           </w:p>
         </w:tc>
@@ -2920,7 +2920,7 @@
               <w:rPr>
                 <w:sz w:val="19"/>
               </w:rPr>
-              <w:t xml:space="preserve">-0.14 Vegetation Loss</w:t>
+              <w:t xml:space="preserve">+1.39 °C Facility Warming</w:t>
             </w:r>
           </w:p>
         </w:tc>
@@ -2940,7 +2940,7 @@
               <w:rPr>
                 <w:sz w:val="19"/>
               </w:rPr>
-              <w:t xml:space="preserve">Land surface conversion from open/vegetated terrain to built infrastructure.</w:t>
+              <w:t xml:space="preserve">Absorbed and re-radiated heat emission over high-density IT footprint.</w:t>
             </w:r>
           </w:p>
         </w:tc>
@@ -2962,7 +2962,7 @@
               <w:rPr>
                 <w:sz w:val="19"/>
               </w:rPr>
-              <w:t xml:space="preserve">Built-up Density (OSM)</w:t>
+              <w:t xml:space="preserve">Core NDVI (Vegetation)</w:t>
             </w:r>
           </w:p>
         </w:tc>
@@ -2982,7 +2982,7 @@
               <w:rPr>
                 <w:sz w:val="19"/>
               </w:rPr>
-              <w:t xml:space="preserve">0.005</w:t>
+              <w:t xml:space="preserve">0.235</w:t>
             </w:r>
           </w:p>
         </w:tc>
@@ -3002,7 +3002,7 @@
               <w:rPr>
                 <w:sz w:val="19"/>
               </w:rPr>
-              <w:t xml:space="preserve">0.024</w:t>
+              <w:t xml:space="preserve">0.235 (Low: 0.192 in 2020)</w:t>
             </w:r>
           </w:p>
         </w:tc>
@@ -3022,7 +3022,7 @@
               <w:rPr>
                 <w:sz w:val="19"/>
               </w:rPr>
-              <w:t xml:space="preserve">+380% Structural Density</w:t>
+              <w:t xml:space="preserve">-0.043 Low during construction</w:t>
             </w:r>
           </w:p>
         </w:tc>
@@ -3042,7 +3042,7 @@
               <w:rPr>
                 <w:sz w:val="19"/>
               </w:rPr>
-              <w:t xml:space="preserve">Expansion of heavy high-voltage sub-stations, generator pads, and facility halls.</w:t>
+              <w:t xml:space="preserve">Vegetation trough during heavy facility earthworks and construction.</w:t>
             </w:r>
           </w:p>
         </w:tc>
@@ -3064,6 +3064,108 @@
               <w:rPr>
                 <w:sz w:val="19"/>
               </w:rPr>
+              <w:t xml:space="preserve">Built-up Density (OSM)</w:t>
+            </w:r>
+          </w:p>
+        </w:tc>
+        <w:tc>
+          <w:tcPr>
+            <w:tcW w:w="1600" w:type="dxa"/>
+            <w:shd w:val="clear" w:color="auto" w:fill="F8FAFC"/>
+            <w:tcMar>
+              <w:top w:w="100" w:type="dxa"/>
+              <w:bottom w:w="100" w:type="dxa"/>
+              <w:left w:w="140" w:type="dxa"/>
+              <w:right w:w="140" w:type="dxa"/>
+            </w:tcMar>
+          </w:tcPr>
+          <w:p>
+            <w:r>
+              <w:rPr>
+                <w:sz w:val="19"/>
+              </w:rPr>
+              <w:t xml:space="preserve">0.120 (Historical est)</w:t>
+            </w:r>
+          </w:p>
+        </w:tc>
+        <w:tc>
+          <w:tcPr>
+            <w:tcW w:w="1600" w:type="dxa"/>
+            <w:shd w:val="clear" w:color="auto" w:fill="F8FAFC"/>
+            <w:tcMar>
+              <w:top w:w="100" w:type="dxa"/>
+              <w:bottom w:w="100" w:type="dxa"/>
+              <w:left w:w="140" w:type="dxa"/>
+              <w:right w:w="140" w:type="dxa"/>
+            </w:tcMar>
+          </w:tcPr>
+          <w:p>
+            <w:r>
+              <w:rPr>
+                <w:sz w:val="19"/>
+              </w:rPr>
+              <w:t xml:space="preserve">0.449 (True Survey)</w:t>
+            </w:r>
+          </w:p>
+        </w:tc>
+        <w:tc>
+          <w:tcPr>
+            <w:tcW w:w="1800" w:type="dxa"/>
+            <w:shd w:val="clear" w:color="auto" w:fill="F8FAFC"/>
+            <w:tcMar>
+              <w:top w:w="100" w:type="dxa"/>
+              <w:bottom w:w="100" w:type="dxa"/>
+              <w:left w:w="140" w:type="dxa"/>
+              <w:right w:w="140" w:type="dxa"/>
+            </w:tcMar>
+          </w:tcPr>
+          <w:p>
+            <w:r>
+              <w:rPr>
+                <w:sz w:val="19"/>
+              </w:rPr>
+              <w:t xml:space="preserve">+274% Structural Density</w:t>
+            </w:r>
+          </w:p>
+        </w:tc>
+        <w:tc>
+          <w:tcPr>
+            <w:tcW w:w="2600" w:type="dxa"/>
+            <w:shd w:val="clear" w:color="auto" w:fill="F8FAFC"/>
+            <w:tcMar>
+              <w:top w:w="100" w:type="dxa"/>
+              <w:bottom w:w="100" w:type="dxa"/>
+              <w:left w:w="140" w:type="dxa"/>
+              <w:right w:w="140" w:type="dxa"/>
+            </w:tcMar>
+          </w:tcPr>
+          <w:p>
+            <w:r>
+              <w:rPr>
+                <w:sz w:val="19"/>
+              </w:rPr>
+              <w:t xml:space="preserve">High structural footprint with 627 building polygons within 500m core.</w:t>
+            </w:r>
+          </w:p>
+        </w:tc>
+      </w:tr>
+      <w:tr>
+        <w:tc>
+          <w:tcPr>
+            <w:tcW w:w="1800" w:type="dxa"/>
+            <w:shd w:val="clear" w:color="auto" w:fill="FFFFFF"/>
+            <w:tcMar>
+              <w:top w:w="100" w:type="dxa"/>
+              <w:bottom w:w="100" w:type="dxa"/>
+              <w:left w:w="140" w:type="dxa"/>
+              <w:right w:w="140" w:type="dxa"/>
+            </w:tcMar>
+          </w:tcPr>
+          <w:p>
+            <w:r>
+              <w:rPr>
+                <w:sz w:val="19"/>
+              </w:rPr>
               <w:t xml:space="preserve">Ambient Air Temp (ERA5)</w:t>
             </w:r>
           </w:p>
@@ -3071,80 +3173,80 @@
         <w:tc>
           <w:tcPr>
             <w:tcW w:w="1600" w:type="dxa"/>
-            <w:shd w:val="clear" w:color="auto" w:fill="F8FAFC"/>
-            <w:tcMar>
-              <w:top w:w="100" w:type="dxa"/>
-              <w:bottom w:w="100" w:type="dxa"/>
-              <w:left w:w="140" w:type="dxa"/>
-              <w:right w:w="140" w:type="dxa"/>
-            </w:tcMar>
-          </w:tcPr>
-          <w:p>
-            <w:r>
-              <w:rPr>
-                <w:sz w:val="19"/>
-              </w:rPr>
-              <w:t xml:space="preserve">30.8 °C</w:t>
+            <w:shd w:val="clear" w:color="auto" w:fill="FFFFFF"/>
+            <w:tcMar>
+              <w:top w:w="100" w:type="dxa"/>
+              <w:bottom w:w="100" w:type="dxa"/>
+              <w:left w:w="140" w:type="dxa"/>
+              <w:right w:w="140" w:type="dxa"/>
+            </w:tcMar>
+          </w:tcPr>
+          <w:p>
+            <w:r>
+              <w:rPr>
+                <w:sz w:val="19"/>
+              </w:rPr>
+              <w:t xml:space="preserve">26.67 °C</w:t>
             </w:r>
           </w:p>
         </w:tc>
         <w:tc>
           <w:tcPr>
             <w:tcW w:w="1600" w:type="dxa"/>
-            <w:shd w:val="clear" w:color="auto" w:fill="F8FAFC"/>
-            <w:tcMar>
-              <w:top w:w="100" w:type="dxa"/>
-              <w:bottom w:w="100" w:type="dxa"/>
-              <w:left w:w="140" w:type="dxa"/>
-              <w:right w:w="140" w:type="dxa"/>
-            </w:tcMar>
-          </w:tcPr>
-          <w:p>
-            <w:r>
-              <w:rPr>
-                <w:sz w:val="19"/>
-              </w:rPr>
-              <w:t xml:space="preserve">31.2 °C</w:t>
+            <w:shd w:val="clear" w:color="auto" w:fill="FFFFFF"/>
+            <w:tcMar>
+              <w:top w:w="100" w:type="dxa"/>
+              <w:bottom w:w="100" w:type="dxa"/>
+              <w:left w:w="140" w:type="dxa"/>
+              <w:right w:w="140" w:type="dxa"/>
+            </w:tcMar>
+          </w:tcPr>
+          <w:p>
+            <w:r>
+              <w:rPr>
+                <w:sz w:val="19"/>
+              </w:rPr>
+              <w:t xml:space="preserve">27.33 °C</w:t>
             </w:r>
           </w:p>
         </w:tc>
         <w:tc>
           <w:tcPr>
             <w:tcW w:w="1800" w:type="dxa"/>
-            <w:shd w:val="clear" w:color="auto" w:fill="F8FAFC"/>
-            <w:tcMar>
-              <w:top w:w="100" w:type="dxa"/>
-              <w:bottom w:w="100" w:type="dxa"/>
-              <w:left w:w="140" w:type="dxa"/>
-              <w:right w:w="140" w:type="dxa"/>
-            </w:tcMar>
-          </w:tcPr>
-          <w:p>
-            <w:r>
-              <w:rPr>
-                <w:sz w:val="19"/>
-              </w:rPr>
-              <w:t xml:space="preserve">+0.40 °C Regional Shift</w:t>
+            <w:shd w:val="clear" w:color="auto" w:fill="FFFFFF"/>
+            <w:tcMar>
+              <w:top w:w="100" w:type="dxa"/>
+              <w:bottom w:w="100" w:type="dxa"/>
+              <w:left w:w="140" w:type="dxa"/>
+              <w:right w:w="140" w:type="dxa"/>
+            </w:tcMar>
+          </w:tcPr>
+          <w:p>
+            <w:r>
+              <w:rPr>
+                <w:sz w:val="19"/>
+              </w:rPr>
+              <w:t xml:space="preserve">+0.66 °C Regional Background</w:t>
             </w:r>
           </w:p>
         </w:tc>
         <w:tc>
           <w:tcPr>
             <w:tcW w:w="2600" w:type="dxa"/>
-            <w:shd w:val="clear" w:color="auto" w:fill="F8FAFC"/>
-            <w:tcMar>
-              <w:top w:w="100" w:type="dxa"/>
-              <w:bottom w:w="100" w:type="dxa"/>
-              <w:left w:w="140" w:type="dxa"/>
-              <w:right w:w="140" w:type="dxa"/>
-            </w:tcMar>
-          </w:tcPr>
-          <w:p>
-            <w:r>
-              <w:rPr>
-                <w:sz w:val="19"/>
-              </w:rPr>
-              <w:t xml:space="preserve">Thermal anomaly exceeds background warming by +3.00 °C.</w:t>
+            <w:shd w:val="clear" w:color="auto" w:fill="FFFFFF"/>
+            <w:tcMar>
+              <w:top w:w="100" w:type="dxa"/>
+              <w:bottom w:w="100" w:type="dxa"/>
+              <w:left w:w="140" w:type="dxa"/>
+              <w:right w:w="140" w:type="dxa"/>
+            </w:tcMar>
+          </w:tcPr>
+          <w:p>
+            <w:r>
+              <w:rPr>
+                <w:sz w:val="19"/>
+              </w:rPr>
+              <w:t xml:space="preserve">Observed core thermal plume exceeds background air temperature by &gt;13 °C.</w:t>
             </w:r>
           </w:p>
         </w:tc>

</xml_diff>